<commit_message>
Lot A : traçabilité exacte des variations, grandeur de l'indicateur, unités, dimension nommée ; tests de non-régression ; exemples régénérés
Co-Authored-By: Claude Opus 5.5 <noreply@anthropic.com>
Claude-Session: https://claude.ai/code/session_013JXMEQCNGgRjDzvz3X6fC9
</commit_message>
<xml_diff>
--- a/data/outputs/commentaire_exemple.docx
+++ b/data/outputs/commentaire_exemple.docx
@@ -2,15 +2,6 @@
 <file path=word/document.xml><?xml version="1.0" encoding="utf-8"?>
 <w:document xmlns:wpc="http://schemas.microsoft.com/office/word/2010/wordprocessingCanvas" xmlns:mo="http://schemas.microsoft.com/office/mac/office/2008/main" xmlns:mc="http://schemas.openxmlformats.org/markup-compatibility/2006" xmlns:mv="urn:schemas-microsoft-com:mac:vml" xmlns:o="urn:schemas-microsoft-com:office:office" xmlns:r="http://schemas.openxmlformats.org/officeDocument/2006/relationships" xmlns:m="http://schemas.openxmlformats.org/officeDocument/2006/math" xmlns:v="urn:schemas-microsoft-com:vml" xmlns:wp14="http://schemas.microsoft.com/office/word/2010/wordprocessingDrawing" xmlns:wp="http://schemas.openxmlformats.org/drawingml/2006/wordprocessingDrawing" xmlns:w10="urn:schemas-microsoft-com:office:word" xmlns:w="http://schemas.openxmlformats.org/wordprocessingml/2006/main" xmlns:w14="http://schemas.microsoft.com/office/word/2010/wordml" xmlns:wpg="http://schemas.microsoft.com/office/word/2010/wordprocessingGroup" xmlns:wpi="http://schemas.microsoft.com/office/word/2010/wordprocessingInk" xmlns:wne="http://schemas.microsoft.com/office/word/2006/wordml" xmlns:wps="http://schemas.microsoft.com/office/word/2010/wordprocessingShape" mc:Ignorable="w14 wp14">
   <w:body>
-    <w:p>
-      <w:r>
-        <w:rPr>
-          <w:color w:val="595959"/>
-          <w:sz w:val="18"/>
-        </w:rPr>
-        <w:t>MINPMEESA — Cellule des Statistiques</w:t>
-      </w:r>
-    </w:p>
     <w:p>
       <w:pPr>
         <w:pStyle w:val="Title"/>
@@ -85,7 +76,7 @@
           <w:color w:val="595959"/>
           <w:sz w:val="16"/>
         </w:rPr>
-        <w:t>Sources : variation calculée (var_rel_pct) : Yaoundé, valeurs n° 10373 et n° 10372 (réf. 2023)</w:t>
+        <w:t>Sources : variation calculée (var_rel_pct) : Total, valeurs n° 10445 et n° 10444 (réf. 2023)</w:t>
       </w:r>
     </w:p>
     <w:p>
@@ -126,7 +117,7 @@
     </w:p>
     <w:p>
       <w:r>
-        <w:t>Par rapport à 2023, l'évolution la plus marquée concerne « Ebolowa » (hausse de 8,4 %).</w:t>
+        <w:t>Par rapport à 2023, l'évolution la plus marquée concerne « Ebolowa » (hausse de 8,4 % de l'effectif).</w:t>
       </w:r>
     </w:p>
     <w:p>
@@ -151,6 +142,7 @@
       </w:r>
     </w:p>
     <w:sectPr>
+      <w:headerReference w:type="default" r:id="rId9"/>
       <w:pgSz w:w="12240" w:h="15840"/>
       <w:pgMar w:top="1440" w:right="1800" w:bottom="1440" w:left="1800" w:header="720" w:footer="720" w:gutter="0"/>
       <w:cols w:space="720"/>
@@ -158,6 +150,23 @@
     </w:sectPr>
   </w:body>
 </w:document>
+</file>
+
+<file path=word/header1.xml><?xml version="1.0" encoding="utf-8"?>
+<w:hdr xmlns:m="http://schemas.openxmlformats.org/officeDocument/2006/math" xmlns:mc="http://schemas.openxmlformats.org/markup-compatibility/2006" xmlns:mo="http://schemas.microsoft.com/office/mac/office/2008/main" xmlns:mv="urn:schemas-microsoft-com:mac:vml" xmlns:o="urn:schemas-microsoft-com:office:office" xmlns:r="http://schemas.openxmlformats.org/officeDocument/2006/relationships" xmlns:v="urn:schemas-microsoft-com:vml" xmlns:w10="urn:schemas-microsoft-com:office:word" xmlns:w14="http://schemas.microsoft.com/office/word/2010/wordml" xmlns:w="http://schemas.openxmlformats.org/wordprocessingml/2006/main" xmlns:wne="http://schemas.microsoft.com/office/word/2006/wordml" xmlns:wp14="http://schemas.microsoft.com/office/word/2010/wordprocessingDrawing" xmlns:wp="http://schemas.openxmlformats.org/drawingml/2006/wordprocessingDrawing" xmlns:wpc="http://schemas.microsoft.com/office/word/2010/wordprocessingCanvas" xmlns:wpg="http://schemas.microsoft.com/office/word/2010/wordprocessingGroup" xmlns:wpi="http://schemas.microsoft.com/office/word/2010/wordprocessingInk" xmlns:wps="http://schemas.microsoft.com/office/word/2010/wordprocessingShape" mc:Ignorable="w14 wp14">
+  <w:p>
+    <w:pPr>
+      <w:pStyle w:val="Header"/>
+    </w:pPr>
+    <w:r>
+      <w:rPr>
+        <w:color w:val="595959"/>
+        <w:sz w:val="18"/>
+      </w:rPr>
+      <w:t>ANALYS'PME — MINPMEESA — Cellule des Statistiques</w:t>
+    </w:r>
+  </w:p>
+</w:hdr>
 </file>
 
 <file path=word/numbering.xml><?xml version="1.0" encoding="utf-8"?>
@@ -590,7 +599,7 @@
       <w:rFonts w:asciiTheme="majorHAnsi" w:eastAsiaTheme="majorEastAsia" w:hAnsiTheme="majorHAnsi" w:cstheme="majorBidi"/>
       <w:b/>
       <w:bCs/>
-      <w:color w:val="365F91" w:themeColor="accent1" w:themeShade="BF"/>
+      <w:color w:val="007A5E"/>
       <w:sz w:val="28"/>
       <w:szCs w:val="28"/>
     </w:rPr>
@@ -614,7 +623,7 @@
       <w:rFonts w:asciiTheme="majorHAnsi" w:eastAsiaTheme="majorEastAsia" w:hAnsiTheme="majorHAnsi" w:cstheme="majorBidi"/>
       <w:b/>
       <w:bCs/>
-      <w:color w:val="4F81BD" w:themeColor="accent1"/>
+      <w:color w:val="007A5E"/>
       <w:sz w:val="26"/>
       <w:szCs w:val="26"/>
     </w:rPr>
@@ -638,7 +647,7 @@
       <w:rFonts w:asciiTheme="majorHAnsi" w:eastAsiaTheme="majorEastAsia" w:hAnsiTheme="majorHAnsi" w:cstheme="majorBidi"/>
       <w:b/>
       <w:bCs/>
-      <w:color w:val="4F81BD" w:themeColor="accent1"/>
+      <w:color w:val="007A5E"/>
     </w:rPr>
   </w:style>
   <w:style w:type="paragraph" w:styleId="Heading4">
@@ -877,7 +886,7 @@
     </w:pPr>
     <w:rPr>
       <w:rFonts w:asciiTheme="majorHAnsi" w:eastAsiaTheme="majorEastAsia" w:hAnsiTheme="majorHAnsi" w:cstheme="majorBidi"/>
-      <w:color w:val="17365D" w:themeColor="text2" w:themeShade="BF"/>
+      <w:color w:val="007A5E"/>
       <w:spacing w:val="5"/>
       <w:kern w:val="28"/>
       <w:sz w:val="52"/>

</xml_diff>

<commit_message>
Lot B : note stratégique (chiffres clés, messages hiérarchisés, pistes typées, une évolution par grandeur, seuil d'effectif) ; variations des colonnes subdivisées (E20) ; % collé accepté
Co-Authored-By: Claude Opus 5.5 <noreply@anthropic.com>
Claude-Session: https://claude.ai/code/session_013JXMEQCNGgRjDzvz3X6fC9
</commit_message>
<xml_diff>
--- a/data/outputs/commentaire_exemple.docx
+++ b/data/outputs/commentaire_exemple.docx
@@ -117,7 +117,7 @@
     </w:p>
     <w:p>
       <w:r>
-        <w:t>Par rapport à 2023, l'évolution la plus marquée concerne « Ebolowa » (hausse de 8,4 % de l'effectif).</w:t>
+        <w:t>Par rapport à 2023, l'évolution la plus marquée concerne « Bamenda » (hausse de 7,8 % de l'effectif).</w:t>
       </w:r>
     </w:p>
     <w:p>
@@ -130,7 +130,7 @@
           <w:color w:val="595959"/>
           <w:sz w:val="16"/>
         </w:rPr>
-        <w:t>Sources : variation calculée (var_rel_pct) : Ebolowa, valeurs n° 10408 et n° 10407 (réf. 2023)</w:t>
+        <w:t>Sources : variation calculée (var_rel_pct) : Bamenda, valeurs n° 10401 et n° 10400 (réf. 2023)</w:t>
       </w:r>
     </w:p>
     <w:p>

</xml_diff>

<commit_message>
Prototype plus correct et plus professionnel : sources lisibles, accueil tableau de bord, graphique de l'indicateur, surlignage, page Validation (double lecture), gabarits par défaut sans Ollama ; corrections de rédaction (catégories au même rythme, total sans libellé)
Co-Authored-By: Claude Opus 5.5 <noreply@anthropic.com>
Claude-Session: https://claude.ai/code/session_013JXMEQCNGgRjDzvz3X6fC9
</commit_message>
<xml_diff>
--- a/data/outputs/commentaire_exemple.docx
+++ b/data/outputs/commentaire_exemple.docx
@@ -20,7 +20,7 @@
           <w:color w:val="595959"/>
           <w:sz w:val="16"/>
         </w:rPr>
-        <w:t>Exercice 2024 ; tableau 7 de l'Annuaire (annuaire_2024) ; modèle : extractif (sans modèle de langage)</w:t>
+        <w:t>Exercice 2024 ; Annuaire 2024, tableau 7 ; rédaction : extractif (sans modèle de langage)</w:t>
       </w:r>
     </w:p>
     <w:p>
@@ -58,7 +58,7 @@
           <w:color w:val="595959"/>
           <w:sz w:val="16"/>
         </w:rPr>
-        <w:t>Sources : annuaire_2024, tableau 7, p. 19 (Total | 2024)</w:t>
+        <w:t>Sources : Annuaire 2024, tableau 7, p. 19 — Total, 2024</w:t>
       </w:r>
     </w:p>
     <w:p>
@@ -76,7 +76,7 @@
           <w:color w:val="595959"/>
           <w:sz w:val="16"/>
         </w:rPr>
-        <w:t>Sources : variation calculée (var_rel_pct) : Total, valeurs n° 10445 et n° 10444 (réf. 2023)</w:t>
+        <w:t>Sources : Variation calculée par le programme : Total, 2024 / 2023 — Annuaire 2024, tableau 7, p. 19</w:t>
       </w:r>
     </w:p>
     <w:p>
@@ -94,7 +94,7 @@
           <w:color w:val="595959"/>
           <w:sz w:val="16"/>
         </w:rPr>
-        <w:t>Sources : variation calculée (var_rel_pct) : Total, valeurs n° 10445 et n° 10439 (réf. 2018)</w:t>
+        <w:t>Sources : Variation calculée par le programme : Total, 2024 / 2018 — Annuaire 2024, tableau 7, p. 19</w:t>
       </w:r>
     </w:p>
     <w:p>
@@ -112,7 +112,7 @@
           <w:color w:val="595959"/>
           <w:sz w:val="16"/>
         </w:rPr>
-        <w:t>Sources : annuaire_2024, tableau 7, p. 19 (Yaoundé | 2024); annuaire_2024, tableau 7, p. 19 (Douala | 2024)</w:t>
+        <w:t>Sources : Annuaire 2024, tableau 7, p. 19 — Yaoundé, 2024; Annuaire 2024, tableau 7, p. 19 — Douala, 2024</w:t>
       </w:r>
     </w:p>
     <w:p>
@@ -130,7 +130,7 @@
           <w:color w:val="595959"/>
           <w:sz w:val="16"/>
         </w:rPr>
-        <w:t>Sources : variation calculée (var_rel_pct) : Bamenda, valeurs n° 10401 et n° 10400 (réf. 2023)</w:t>
+        <w:t>Sources : Variation calculée par le programme : Bamenda, 2024 / 2023 — Annuaire 2024, tableau 7, p. 19</w:t>
       </w:r>
     </w:p>
     <w:p>
@@ -158,6 +158,43 @@
     <w:pPr>
       <w:pStyle w:val="Header"/>
     </w:pPr>
+    <w:r>
+      <w:drawing>
+        <wp:inline xmlns:a="http://schemas.openxmlformats.org/drawingml/2006/main" xmlns:pic="http://schemas.openxmlformats.org/drawingml/2006/picture">
+          <wp:extent cx="473710" cy="432000"/>
+          <wp:docPr id="1" name="Picture 1"/>
+          <wp:cNvGraphicFramePr>
+            <a:graphicFrameLocks noChangeAspect="1"/>
+          </wp:cNvGraphicFramePr>
+          <a:graphic>
+            <a:graphicData uri="http://schemas.openxmlformats.org/drawingml/2006/picture">
+              <pic:pic>
+                <pic:nvPicPr>
+                  <pic:cNvPr id="0" name="logo.png"/>
+                  <pic:cNvPicPr/>
+                </pic:nvPicPr>
+                <pic:blipFill>
+                  <a:blip r:embed="rId1"/>
+                  <a:stretch>
+                    <a:fillRect/>
+                  </a:stretch>
+                </pic:blipFill>
+                <pic:spPr>
+                  <a:xfrm>
+                    <a:off x="0" y="0"/>
+                    <a:ext cx="473710" cy="432000"/>
+                  </a:xfrm>
+                  <a:prstGeom prst="rect"/>
+                </pic:spPr>
+              </pic:pic>
+            </a:graphicData>
+          </a:graphic>
+        </wp:inline>
+      </w:drawing>
+    </w:r>
+    <w:r>
+      <w:t xml:space="preserve">   </w:t>
+    </w:r>
     <w:r>
       <w:rPr>
         <w:color w:val="595959"/>
@@ -599,7 +636,7 @@
       <w:rFonts w:asciiTheme="majorHAnsi" w:eastAsiaTheme="majorEastAsia" w:hAnsiTheme="majorHAnsi" w:cstheme="majorBidi"/>
       <w:b/>
       <w:bCs/>
-      <w:color w:val="007A5E"/>
+      <w:color w:val="00563B"/>
       <w:sz w:val="28"/>
       <w:szCs w:val="28"/>
     </w:rPr>
@@ -623,7 +660,7 @@
       <w:rFonts w:asciiTheme="majorHAnsi" w:eastAsiaTheme="majorEastAsia" w:hAnsiTheme="majorHAnsi" w:cstheme="majorBidi"/>
       <w:b/>
       <w:bCs/>
-      <w:color w:val="007A5E"/>
+      <w:color w:val="00563B"/>
       <w:sz w:val="26"/>
       <w:szCs w:val="26"/>
     </w:rPr>
@@ -647,7 +684,7 @@
       <w:rFonts w:asciiTheme="majorHAnsi" w:eastAsiaTheme="majorEastAsia" w:hAnsiTheme="majorHAnsi" w:cstheme="majorBidi"/>
       <w:b/>
       <w:bCs/>
-      <w:color w:val="007A5E"/>
+      <w:color w:val="00563B"/>
     </w:rPr>
   </w:style>
   <w:style w:type="paragraph" w:styleId="Heading4">
@@ -886,7 +923,7 @@
     </w:pPr>
     <w:rPr>
       <w:rFonts w:asciiTheme="majorHAnsi" w:eastAsiaTheme="majorEastAsia" w:hAnsiTheme="majorHAnsi" w:cstheme="majorBidi"/>
-      <w:color w:val="007A5E"/>
+      <w:color w:val="00563B"/>
       <w:spacing w:val="5"/>
       <w:kern w:val="28"/>
       <w:sz w:val="52"/>

</xml_diff>

<commit_message>
Note d'analyse : corrections de rédaction relevées à la relecture (libellés fusionnés, parts > 100 %, Ensemble, dimension géographique, grandeurs mêlées, doublons, perspectives variées) et contrôle de cohérence entre tableaux de l'Annuaire
Co-Authored-By: Claude Opus 5.5 <noreply@anthropic.com>
Claude-Session: https://claude.ai/code/session_013JXMEQCNGgRjDzvz3X6fC9
</commit_message>
<xml_diff>
--- a/data/outputs/commentaire_exemple.docx
+++ b/data/outputs/commentaire_exemple.docx
@@ -99,7 +99,7 @@
     </w:p>
     <w:p>
       <w:r>
-        <w:t>Les valeurs les plus élevées en 2024 reviennent à « Yaoundé » (9 858) et à « Douala » (6 815).</w:t>
+        <w:t>Dans la répartition par localisation géographique, les valeurs les plus élevées en 2024 reviennent à « Yaoundé » (9 858) et à « Douala » (6 815).</w:t>
       </w:r>
     </w:p>
     <w:p>
@@ -117,7 +117,7 @@
     </w:p>
     <w:p>
       <w:r>
-        <w:t>Par rapport à 2023, l'évolution la plus marquée concerne « Bamenda » (hausse de 7,8 % de l'effectif).</w:t>
+        <w:t>Par rapport à 2023, dans la répartition par localisation géographique, l'évolution la plus marquée concerne « Bamenda » (hausse de 7,8 % de l'effectif).</w:t>
       </w:r>
     </w:p>
     <w:p>
@@ -138,7 +138,7 @@
         <w:pStyle w:val="ListBullet"/>
       </w:pPr>
       <w:r>
-        <w:t>Le suivi de cet indicateur lors du prochain exercice permettra de confirmer ou non cette orientation.</w:t>
+        <w:t>Le prochain exercice permettra de vérifier si cette progression se poursuit.</w:t>
       </w:r>
     </w:p>
     <w:sectPr>

</xml_diff>